<commit_message>
Edited the doc iteration 3
</commit_message>
<xml_diff>
--- a/docs/report.docs/Iteration 3 .docx
+++ b/docs/report.docs/Iteration 3 .docx
@@ -5385,15 +5385,7 @@
         <w:pStyle w:val="Heading3"/>
       </w:pPr>
       <w:r>
-        <w:t xml:space="preserve">Photo Upload &amp; Skin Tone / Undertone </w:t>
-      </w:r>
-      <w:proofErr w:type="gramStart"/>
-      <w:r>
-        <w:t>Analysis  (</w:t>
-      </w:r>
-      <w:proofErr w:type="gramEnd"/>
-      <w:r>
-        <w:t>US-06)</w:t>
+        <w:t>Photo Upload &amp; Skin Tone / Undertone Analysis  (US-06)</w:t>
       </w:r>
     </w:p>
     <w:p>
@@ -5473,15 +5465,7 @@
         <w:pStyle w:val="Heading3"/>
       </w:pPr>
       <w:r>
-        <w:t xml:space="preserve">Wardrobe Upload &amp; Outfit </w:t>
-      </w:r>
-      <w:proofErr w:type="gramStart"/>
-      <w:r>
-        <w:t>Suggestion  (</w:t>
-      </w:r>
-      <w:proofErr w:type="gramEnd"/>
-      <w:r>
-        <w:t>US-09)</w:t>
+        <w:t>Wardrobe Upload &amp; Outfit Suggestion  (US-09)</w:t>
       </w:r>
     </w:p>
     <w:p>
@@ -5569,15 +5553,7 @@
         <w:pStyle w:val="Heading3"/>
       </w:pPr>
       <w:r>
-        <w:t xml:space="preserve">Face Shape Detection &amp; Style </w:t>
-      </w:r>
-      <w:proofErr w:type="gramStart"/>
-      <w:r>
-        <w:t>Suggestions  (</w:t>
-      </w:r>
-      <w:proofErr w:type="gramEnd"/>
-      <w:r>
-        <w:t>US-07 &amp; US-10)</w:t>
+        <w:t>Face Shape Detection &amp; Style Suggestions  (US-07 &amp; US-10)</w:t>
       </w:r>
     </w:p>
     <w:p>
@@ -5819,15 +5795,7 @@
         <w:pStyle w:val="Heading3"/>
       </w:pPr>
       <w:r>
-        <w:t xml:space="preserve">Sequence Diagram — Photo Upload &amp; Skin Tone </w:t>
-      </w:r>
-      <w:proofErr w:type="gramStart"/>
-      <w:r>
-        <w:t>Analysis  (</w:t>
-      </w:r>
-      <w:proofErr w:type="gramEnd"/>
-      <w:r>
-        <w:t>US-06)</w:t>
+        <w:t>Sequence Diagram — Photo Upload &amp; Skin Tone Analysis  (US-06)</w:t>
       </w:r>
     </w:p>
     <w:p>
@@ -5913,15 +5881,7 @@
       </w:pPr>
       <w:r>
         <w:lastRenderedPageBreak/>
-        <w:t xml:space="preserve">Sequence Diagram — Wardrobe Upload &amp; Outfit </w:t>
-      </w:r>
-      <w:proofErr w:type="gramStart"/>
-      <w:r>
-        <w:t>Suggestion  (</w:t>
-      </w:r>
-      <w:proofErr w:type="gramEnd"/>
-      <w:r>
-        <w:t>US-09)</w:t>
+        <w:t>Sequence Diagram — Wardrobe Upload &amp; Outfit Suggestion  (US-09)</w:t>
       </w:r>
     </w:p>
     <w:p>
@@ -6010,15 +5970,7 @@
       </w:pPr>
       <w:r>
         <w:lastRenderedPageBreak/>
-        <w:t xml:space="preserve">Sequence Diagram — Product </w:t>
-      </w:r>
-      <w:proofErr w:type="gramStart"/>
-      <w:r>
-        <w:t>Recommendations  (</w:t>
-      </w:r>
-      <w:proofErr w:type="gramEnd"/>
-      <w:r>
-        <w:t>US-08)</w:t>
+        <w:t>Sequence Diagram — Product Recommendations  (US-08)</w:t>
       </w:r>
     </w:p>
     <w:p>
@@ -6431,17 +6383,12 @@
         <w:t xml:space="preserve">, </w:t>
       </w:r>
       <w:proofErr w:type="spellStart"/>
-      <w:proofErr w:type="gramStart"/>
       <w:r>
         <w:t>itemIds</w:t>
       </w:r>
       <w:proofErr w:type="spellEnd"/>
       <w:r>
-        <w:t>[</w:t>
-      </w:r>
-      <w:proofErr w:type="gramEnd"/>
-      <w:r>
-        <w:t xml:space="preserve">], </w:t>
+        <w:t xml:space="preserve">[], </w:t>
       </w:r>
       <w:proofErr w:type="spellStart"/>
       <w:r>
@@ -7569,14 +7516,7 @@
         <w:rPr>
           <w:i/>
         </w:rPr>
-        <w:t xml:space="preserve">Create </w:t>
-      </w:r>
-      <w:proofErr w:type="gramStart"/>
-      <w:r>
-        <w:rPr>
-          <w:i/>
-        </w:rPr>
-        <w:t xml:space="preserve">Account </w:t>
+        <w:t xml:space="preserve">Create Account </w:t>
       </w:r>
       <w:r>
         <w:rPr>
@@ -7584,7 +7524,6 @@
         </w:rPr>
         <w:t xml:space="preserve"> Screen</w:t>
       </w:r>
-      <w:proofErr w:type="gramEnd"/>
     </w:p>
     <w:p>
       <w:pPr>
@@ -15657,21 +15596,7 @@
               <w:rPr>
                 <w:sz w:val="16"/>
               </w:rPr>
-              <w:t xml:space="preserve">Booking </w:t>
-            </w:r>
-            <w:proofErr w:type="gramStart"/>
-            <w:r>
-              <w:rPr>
-                <w:sz w:val="16"/>
-              </w:rPr>
-              <w:t>status !</w:t>
-            </w:r>
-            <w:proofErr w:type="gramEnd"/>
-            <w:r>
-              <w:rPr>
-                <w:sz w:val="16"/>
-              </w:rPr>
-              <w:t>= Completed</w:t>
+              <w:t>Booking status != Completed</w:t>
             </w:r>
           </w:p>
         </w:tc>
@@ -20391,10 +20316,98 @@
     <w:p>
       <w:pPr>
         <w:pStyle w:val="ListBullet"/>
-        <w:spacing w:after="60"/>
       </w:pPr>
       <w:r>
-        <w:t>Iterative development made the project easier to control because each sprint delivered a working part of the system before moving to the next module.</w:t>
+        <w:t>Iterative development made the project easier to control because each sprint delivered a working, testable increment before the next module began, reducing integration risk across all three sprints.</w:t>
+      </w:r>
+    </w:p>
+    <w:p>
+      <w:pPr>
+        <w:pStyle w:val="ListBullet"/>
+      </w:pPr>
+      <w:r>
+        <w:t>Clear user stories and acceptance criteria helped the team identify when a feature was truly complete, preventing scope creep and keeping sprint goals focused and measurable.</w:t>
+      </w:r>
+    </w:p>
+    <w:p>
+      <w:pPr>
+        <w:pStyle w:val="ListBullet"/>
+      </w:pPr>
+      <w:r>
+        <w:t>Layered architecture improved debugging because frontend UI issues, backend logic errors, and database problems could each be isolated and fixed independently without affecting the other tiers.</w:t>
+      </w:r>
+    </w:p>
+    <w:p>
+      <w:pPr>
+        <w:pStyle w:val="ListBullet"/>
+      </w:pPr>
+      <w:r>
+        <w:t xml:space="preserve">Database planning proved critical in Sprint 3, where multiple interdependent tables — </w:t>
+      </w:r>
+      <w:proofErr w:type="spellStart"/>
+      <w:r>
+        <w:t>parlours</w:t>
+      </w:r>
+      <w:proofErr w:type="spellEnd"/>
+      <w:r>
+        <w:t xml:space="preserve">, </w:t>
+      </w:r>
+      <w:proofErr w:type="spellStart"/>
+      <w:r>
+        <w:t>parlour_bookings</w:t>
+      </w:r>
+      <w:proofErr w:type="spellEnd"/>
+      <w:r>
+        <w:t xml:space="preserve">, </w:t>
+      </w:r>
+      <w:proofErr w:type="spellStart"/>
+      <w:r>
+        <w:t>parlour_chat_log</w:t>
+      </w:r>
+      <w:proofErr w:type="spellEnd"/>
+      <w:r>
+        <w:t xml:space="preserve">, and </w:t>
+      </w:r>
+      <w:proofErr w:type="spellStart"/>
+      <w:r>
+        <w:t>parlour_notifications</w:t>
+      </w:r>
+      <w:proofErr w:type="spellEnd"/>
+      <w:r>
+        <w:t xml:space="preserve"> — had to be designed together to support cascading operations like booking status changes and notifications.</w:t>
+      </w:r>
+    </w:p>
+    <w:p>
+      <w:pPr>
+        <w:pStyle w:val="ListBullet"/>
+      </w:pPr>
+      <w:r>
+        <w:t>Boundary testing uncovered real validation gaps even in forms that appeared to work normally. Edge cases such as 7-character passwords, duplicate emails, empty login fields, bookings placed in the past, ratings outside the 1–5 range, and unauthenticated admin requests would have gone undetected without systematic BVA.</w:t>
+      </w:r>
+    </w:p>
+    <w:p>
+      <w:pPr>
+        <w:pStyle w:val="ListBullet"/>
+      </w:pPr>
+      <w:r>
+        <w:t xml:space="preserve">Admin portal development highlighted the importance of role-based access control. Separating admin-only endpoints behind a dedicated authentication check kept </w:t>
+      </w:r>
+      <w:proofErr w:type="spellStart"/>
+      <w:r>
+        <w:t>parlour</w:t>
+      </w:r>
+      <w:proofErr w:type="spellEnd"/>
+      <w:r>
+        <w:t xml:space="preserve"> verification and booking oversight secure and independent from the regular user flow.</w:t>
+      </w:r>
+    </w:p>
+    <w:p>
+      <w:pPr>
+        <w:pStyle w:val="ListBullet"/>
+      </w:pPr>
+      <w:r>
+        <w:lastRenderedPageBreak/>
+        <w:t>Team coordination through Trello helped track To Do, In Progress, Review, and Done states across all sprint features and made it easy to spot blockers during mid-sprint check-ins.</w:t>
       </w:r>
     </w:p>
     <w:p>
@@ -20402,63 +20415,6 @@
         <w:pStyle w:val="ListBullet"/>
         <w:spacing w:after="60"/>
       </w:pPr>
-      <w:r>
-        <w:t>Clear user stories and acceptance criteria helped the team know when a feature was complete and prevented scope creep.</w:t>
-      </w:r>
-    </w:p>
-    <w:p>
-      <w:pPr>
-        <w:pStyle w:val="ListBullet"/>
-        <w:spacing w:after="60"/>
-      </w:pPr>
-      <w:r>
-        <w:t>Layered architecture improved debugging because frontend UI issues, backend logic issues, and database issues could be checked separately.</w:t>
-      </w:r>
-    </w:p>
-    <w:p>
-      <w:pPr>
-        <w:pStyle w:val="ListBullet"/>
-        <w:spacing w:after="60"/>
-      </w:pPr>
-      <w:r>
-        <w:t xml:space="preserve">Database planning is important because Sprint 3 needed several related tables: salons, </w:t>
-      </w:r>
-      <w:proofErr w:type="spellStart"/>
-      <w:r>
-        <w:t>salon_services</w:t>
-      </w:r>
-      <w:proofErr w:type="spellEnd"/>
-      <w:r>
-        <w:t xml:space="preserve">, bookings, </w:t>
-      </w:r>
-      <w:proofErr w:type="spellStart"/>
-      <w:r>
-        <w:t>chat_messages</w:t>
-      </w:r>
-      <w:proofErr w:type="spellEnd"/>
-      <w:r>
-        <w:t xml:space="preserve"> and reviews.</w:t>
-      </w:r>
-    </w:p>
-    <w:p>
-      <w:pPr>
-        <w:pStyle w:val="ListBullet"/>
-        <w:spacing w:after="60"/>
-      </w:pPr>
-      <w:r>
-        <w:t>Boundary testing is necessary even when the form works normally because edge cases such as 7-character passwords, duplicate emails, and empty login fields reveal validation weaknesses.</w:t>
-      </w:r>
-    </w:p>
-    <w:p>
-      <w:pPr>
-        <w:pStyle w:val="ListBullet"/>
-        <w:spacing w:after="60"/>
-      </w:pPr>
-      <w:r>
-        <w:t>Team coordination through Trello helped track To Do, In Progress, Review, and Done tasks across all sprint features.</w:t>
-      </w:r>
-    </w:p>
-    <w:p>
       <w:r>
         <w:br w:type="page"/>
       </w:r>
@@ -20747,7 +20703,7 @@
   <w:abstractNum w:abstractNumId="8" w15:restartNumberingAfterBreak="0">
     <w:nsid w:val="FFFFFF89"/>
     <w:multiLevelType w:val="singleLevel"/>
-    <w:tmpl w:val="29761A62"/>
+    <w:tmpl w:val="9AAAFAD8"/>
     <w:lvl w:ilvl="0">
       <w:start w:val="1"/>
       <w:numFmt w:val="bullet"/>
@@ -32238,6 +32194,19 @@
       </w:tcPr>
     </w:tblStylePr>
   </w:style>
+  <w:style w:type="paragraph" w:customStyle="1" w:styleId="font-claude-response-body">
+    <w:name w:val="font-claude-response-body"/>
+    <w:basedOn w:val="Normal"/>
+    <w:rsid w:val="000A32A2"/>
+    <w:pPr>
+      <w:spacing w:before="100" w:beforeAutospacing="1" w:after="100" w:afterAutospacing="1" w:line="240" w:lineRule="auto"/>
+    </w:pPr>
+    <w:rPr>
+      <w:rFonts w:cs="Times New Roman"/>
+      <w:sz w:val="24"/>
+      <w:szCs w:val="24"/>
+    </w:rPr>
+  </w:style>
 </w:styles>
 </file>
 

</xml_diff>

<commit_message>
Doc iteration 3 edited
</commit_message>
<xml_diff>
--- a/docs/report.docs/Iteration 3 .docx
+++ b/docs/report.docs/Iteration 3 .docx
@@ -5385,7 +5385,15 @@
         <w:pStyle w:val="Heading3"/>
       </w:pPr>
       <w:r>
-        <w:t>Photo Upload &amp; Skin Tone / Undertone Analysis  (US-06)</w:t>
+        <w:t xml:space="preserve">Photo Upload &amp; Skin Tone / Undertone </w:t>
+      </w:r>
+      <w:proofErr w:type="gramStart"/>
+      <w:r>
+        <w:t>Analysis  (</w:t>
+      </w:r>
+      <w:proofErr w:type="gramEnd"/>
+      <w:r>
+        <w:t>US-06)</w:t>
       </w:r>
     </w:p>
     <w:p>
@@ -5465,7 +5473,15 @@
         <w:pStyle w:val="Heading3"/>
       </w:pPr>
       <w:r>
-        <w:t>Wardrobe Upload &amp; Outfit Suggestion  (US-09)</w:t>
+        <w:t xml:space="preserve">Wardrobe Upload &amp; Outfit </w:t>
+      </w:r>
+      <w:proofErr w:type="gramStart"/>
+      <w:r>
+        <w:t>Suggestion  (</w:t>
+      </w:r>
+      <w:proofErr w:type="gramEnd"/>
+      <w:r>
+        <w:t>US-09)</w:t>
       </w:r>
     </w:p>
     <w:p>
@@ -5553,7 +5569,15 @@
         <w:pStyle w:val="Heading3"/>
       </w:pPr>
       <w:r>
-        <w:t>Face Shape Detection &amp; Style Suggestions  (US-07 &amp; US-10)</w:t>
+        <w:t xml:space="preserve">Face Shape Detection &amp; Style </w:t>
+      </w:r>
+      <w:proofErr w:type="gramStart"/>
+      <w:r>
+        <w:t>Suggestions  (</w:t>
+      </w:r>
+      <w:proofErr w:type="gramEnd"/>
+      <w:r>
+        <w:t>US-07 &amp; US-10)</w:t>
       </w:r>
     </w:p>
     <w:p>
@@ -5795,7 +5819,15 @@
         <w:pStyle w:val="Heading3"/>
       </w:pPr>
       <w:r>
-        <w:t>Sequence Diagram — Photo Upload &amp; Skin Tone Analysis  (US-06)</w:t>
+        <w:t xml:space="preserve">Sequence Diagram — Photo Upload &amp; Skin Tone </w:t>
+      </w:r>
+      <w:proofErr w:type="gramStart"/>
+      <w:r>
+        <w:t>Analysis  (</w:t>
+      </w:r>
+      <w:proofErr w:type="gramEnd"/>
+      <w:r>
+        <w:t>US-06)</w:t>
       </w:r>
     </w:p>
     <w:p>
@@ -5881,7 +5913,15 @@
       </w:pPr>
       <w:r>
         <w:lastRenderedPageBreak/>
-        <w:t>Sequence Diagram — Wardrobe Upload &amp; Outfit Suggestion  (US-09)</w:t>
+        <w:t xml:space="preserve">Sequence Diagram — Wardrobe Upload &amp; Outfit </w:t>
+      </w:r>
+      <w:proofErr w:type="gramStart"/>
+      <w:r>
+        <w:t>Suggestion  (</w:t>
+      </w:r>
+      <w:proofErr w:type="gramEnd"/>
+      <w:r>
+        <w:t>US-09)</w:t>
       </w:r>
     </w:p>
     <w:p>
@@ -5970,7 +6010,15 @@
       </w:pPr>
       <w:r>
         <w:lastRenderedPageBreak/>
-        <w:t>Sequence Diagram — Product Recommendations  (US-08)</w:t>
+        <w:t xml:space="preserve">Sequence Diagram — Product </w:t>
+      </w:r>
+      <w:proofErr w:type="gramStart"/>
+      <w:r>
+        <w:t>Recommendations  (</w:t>
+      </w:r>
+      <w:proofErr w:type="gramEnd"/>
+      <w:r>
+        <w:t>US-08)</w:t>
       </w:r>
     </w:p>
     <w:p>
@@ -6383,12 +6431,17 @@
         <w:t xml:space="preserve">, </w:t>
       </w:r>
       <w:proofErr w:type="spellStart"/>
+      <w:proofErr w:type="gramStart"/>
       <w:r>
         <w:t>itemIds</w:t>
       </w:r>
       <w:proofErr w:type="spellEnd"/>
       <w:r>
-        <w:t xml:space="preserve">[], </w:t>
+        <w:t>[</w:t>
+      </w:r>
+      <w:proofErr w:type="gramEnd"/>
+      <w:r>
+        <w:t xml:space="preserve">], </w:t>
       </w:r>
       <w:proofErr w:type="spellStart"/>
       <w:r>
@@ -7516,14 +7569,16 @@
         <w:rPr>
           <w:i/>
         </w:rPr>
-        <w:t xml:space="preserve">Create Account </w:t>
-      </w:r>
+        <w:t xml:space="preserve">Create </w:t>
+      </w:r>
+      <w:proofErr w:type="gramStart"/>
       <w:r>
         <w:rPr>
           <w:i/>
         </w:rPr>
-        <w:t xml:space="preserve"> Screen</w:t>
-      </w:r>
+        <w:t>Account  Screen</w:t>
+      </w:r>
+      <w:proofErr w:type="gramEnd"/>
     </w:p>
     <w:p>
       <w:pPr>
@@ -7589,13 +7644,7 @@
         <w:rPr>
           <w:i/>
         </w:rPr>
-        <w:t xml:space="preserve">Sign In </w:t>
-      </w:r>
-      <w:r>
-        <w:rPr>
-          <w:i/>
-        </w:rPr>
-        <w:t>Screen</w:t>
+        <w:t>Sign In Screen</w:t>
       </w:r>
     </w:p>
     <w:p>
@@ -7658,13 +7707,7 @@
         <w:rPr>
           <w:i/>
         </w:rPr>
-        <w:t xml:space="preserve">Skin Tone Detection </w:t>
-      </w:r>
-      <w:r>
-        <w:rPr>
-          <w:i/>
-        </w:rPr>
-        <w:t>Screen</w:t>
+        <w:t>Skin Tone Detection Screen</w:t>
       </w:r>
     </w:p>
     <w:p>
@@ -7853,19 +7896,7 @@
         <w:rPr>
           <w:i/>
         </w:rPr>
-        <w:t>Style Suggestion</w:t>
-      </w:r>
-      <w:r>
-        <w:rPr>
-          <w:i/>
-        </w:rPr>
-        <w:t xml:space="preserve">- </w:t>
-      </w:r>
-      <w:r>
-        <w:rPr>
-          <w:i/>
-        </w:rPr>
-        <w:t>Face Shape</w:t>
+        <w:t>Style Suggestion- Face Shape</w:t>
       </w:r>
     </w:p>
     <w:p/>
@@ -8046,13 +8077,7 @@
         <w:rPr>
           <w:i/>
         </w:rPr>
-        <w:t xml:space="preserve">Registered Parlor Details and Bookings </w:t>
-      </w:r>
-      <w:r>
-        <w:rPr>
-          <w:i/>
-        </w:rPr>
-        <w:t>Screen</w:t>
+        <w:t>Registered Parlor Details and Bookings Screen</w:t>
       </w:r>
     </w:p>
     <w:p>
@@ -8113,13 +8138,7 @@
         <w:rPr>
           <w:i/>
         </w:rPr>
-        <w:t xml:space="preserve">Salon Finder </w:t>
-      </w:r>
-      <w:r>
-        <w:rPr>
-          <w:i/>
-        </w:rPr>
-        <w:t>Screen</w:t>
+        <w:t>Salon Finder Screen</w:t>
       </w:r>
     </w:p>
     <w:p>
@@ -8203,6 +8222,9 @@
         <w:jc w:val="center"/>
       </w:pPr>
       <w:r>
+        <w:rPr>
+          <w:noProof/>
+        </w:rPr>
         <w:drawing>
           <wp:inline distT="0" distB="0" distL="0" distR="0" wp14:anchorId="54D0C341" wp14:editId="53D4AA81">
             <wp:extent cx="6400800" cy="2813685"/>
@@ -15596,7 +15618,21 @@
               <w:rPr>
                 <w:sz w:val="16"/>
               </w:rPr>
-              <w:t>Booking status != Completed</w:t>
+              <w:t xml:space="preserve">Booking </w:t>
+            </w:r>
+            <w:proofErr w:type="gramStart"/>
+            <w:r>
+              <w:rPr>
+                <w:sz w:val="16"/>
+              </w:rPr>
+              <w:t>status !</w:t>
+            </w:r>
+            <w:proofErr w:type="gramEnd"/>
+            <w:r>
+              <w:rPr>
+                <w:sz w:val="16"/>
+              </w:rPr>
+              <w:t>= Completed</w:t>
             </w:r>
           </w:p>
         </w:tc>
@@ -20334,7 +20370,7 @@
         <w:pStyle w:val="ListBullet"/>
       </w:pPr>
       <w:r>
-        <w:t>Layered architecture improved debugging because frontend UI issues, backend logic errors, and database problems could each be isolated and fixed independently without affecting the other tiers.</w:t>
+        <w:t>Three-tier architecture improved debugging because Tier 1 (browser), Tier 2 (Flask backend), and Tier 3 (SQLite) have clearly separated responsibilities, so a frontend display issue, a backend logic error, and a database query problem could each be traced and fixed in isolation without touching the other tiers.</w:t>
       </w:r>
     </w:p>
     <w:p>
@@ -20703,7 +20739,7 @@
   <w:abstractNum w:abstractNumId="8" w15:restartNumberingAfterBreak="0">
     <w:nsid w:val="FFFFFF89"/>
     <w:multiLevelType w:val="singleLevel"/>
-    <w:tmpl w:val="9AAAFAD8"/>
+    <w:tmpl w:val="656A2084"/>
     <w:lvl w:ilvl="0">
       <w:start w:val="1"/>
       <w:numFmt w:val="bullet"/>
@@ -21419,7 +21455,6 @@
   <w:style w:type="character" w:default="1" w:styleId="DefaultParagraphFont">
     <w:name w:val="Default Paragraph Font"/>
     <w:uiPriority w:val="1"/>
-    <w:semiHidden/>
     <w:unhideWhenUsed/>
   </w:style>
   <w:style w:type="table" w:default="1" w:styleId="TableNormal">

</xml_diff>